<commit_message>
ajuste de sintesis y nuevo DU
</commit_message>
<xml_diff>
--- a/fuentes/CF03_63110190_DU.docx
+++ b/fuentes/CF03_63110190_DU.docx
@@ -210,7 +210,7 @@
               </wp:anchor>
             </w:drawing>
           </mc:Choice>
-          <mc:Fallback xmlns:a="http://schemas.openxmlformats.org/drawingml/2006/main" xmlns:adec="http://schemas.microsoft.com/office/drawing/2017/decorative" xmlns:pic="http://schemas.openxmlformats.org/drawingml/2006/picture" xmlns:a14="http://schemas.microsoft.com/office/drawing/2010/main">
+          <mc:Fallback xmlns:a14="http://schemas.microsoft.com/office/drawing/2010/main" xmlns:pic="http://schemas.openxmlformats.org/drawingml/2006/picture" xmlns:adec="http://schemas.microsoft.com/office/drawing/2017/decorative" xmlns:a="http://schemas.openxmlformats.org/drawingml/2006/main">
             <w:pict w14:anchorId="75509E97">
               <v:rect id="Rectángulo 3" style="position:absolute;margin-left:-55.7pt;margin-top:26.5pt;width:613.85pt;height:204pt;z-index:-251655168;visibility:visible;mso-wrap-style:square;mso-height-percent:0;mso-wrap-distance-left:9pt;mso-wrap-distance-top:0;mso-wrap-distance-right:9pt;mso-wrap-distance-bottom:0;mso-position-horizontal:absolute;mso-position-horizontal-relative:text;mso-position-vertical:absolute;mso-position-vertical-relative:text;mso-height-percent:0;mso-height-relative:margin;v-text-anchor:middle" alt="&quot;&quot;" o:spid="_x0000_s1026" fillcolor="#00314d" stroked="f" strokeweight="1pt" w14:anchorId="04BF2410" o:gfxdata="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"/>
             </w:pict>
@@ -2132,10 +2132,6 @@
     <w:p>
       <w:pPr>
         <w:pStyle w:val="Video"/>
-        <w:rPr>
-          <w:rStyle w:val="Extranjerismo"/>
-          <w:lang w:val="es-CO"/>
-        </w:rPr>
       </w:pPr>
       <w:r>
         <w:lastRenderedPageBreak/>
@@ -2144,17 +2140,23 @@
     </w:p>
     <w:p>
       <w:pPr>
-        <w:ind w:firstLine="0"/>
-      </w:pPr>
-      <w:r>
+        <w:rPr>
+          <w:lang w:val="es-419"/>
+        </w:rPr>
+      </w:pPr>
+      <w:r>
+        <w:rPr>
+          <w:noProof/>
+          <w:lang w:val="es-419"/>
+        </w:rPr>
         <w:drawing>
-          <wp:inline distT="0" distB="0" distL="0" distR="0" wp14:anchorId="67C12428" wp14:editId="01C5BB3F">
-            <wp:extent cx="5833641" cy="3281724"/>
+          <wp:inline distT="0" distB="0" distL="0" distR="0" wp14:anchorId="0F31EAD7" wp14:editId="76BAD7B2">
+            <wp:extent cx="5347980" cy="2974842"/>
             <wp:effectExtent l="0" t="0" r="0" b="0"/>
-            <wp:docPr id="175081079" name="Imagen 1">
+            <wp:docPr id="1585187074" name="Imagen 4">
               <a:extLst xmlns:a="http://schemas.openxmlformats.org/drawingml/2006/main">
                 <a:ext uri="{C183D7F6-B498-43B3-948B-1728B52AA6E4}">
-                  <adec:decorative xmlns:adec="http://schemas.microsoft.com/office/drawing/2017/decorative" val="1"/>
+                  <adec:decorative xmlns:adec="http://schemas.microsoft.com/office/drawing/2017/decorative" val="0"/>
                 </a:ext>
               </a:extLst>
             </wp:docPr>
@@ -2165,17 +2167,23 @@
               <a:graphicData uri="http://schemas.openxmlformats.org/drawingml/2006/picture">
                 <pic:pic xmlns:pic="http://schemas.openxmlformats.org/drawingml/2006/picture">
                   <pic:nvPicPr>
-                    <pic:cNvPr id="175081079" name="Imagen 1">
+                    <pic:cNvPr id="1585187074" name="Imagen 4">
                       <a:extLst>
                         <a:ext uri="{C183D7F6-B498-43B3-948B-1728B52AA6E4}">
-                          <adec:decorative xmlns:adec="http://schemas.microsoft.com/office/drawing/2017/decorative" val="1"/>
+                          <adec:decorative xmlns:adec="http://schemas.microsoft.com/office/drawing/2017/decorative" val="0"/>
                         </a:ext>
                       </a:extLst>
                     </pic:cNvPr>
                     <pic:cNvPicPr/>
                   </pic:nvPicPr>
                   <pic:blipFill>
-                    <a:blip r:embed="rId13"/>
+                    <a:blip r:embed="rId13">
+                      <a:extLst>
+                        <a:ext uri="{28A0092B-C50C-407E-A947-70E740481C1C}">
+                          <a14:useLocalDpi xmlns:a14="http://schemas.microsoft.com/office/drawing/2010/main" val="0"/>
+                        </a:ext>
+                      </a:extLst>
+                    </a:blip>
                     <a:stretch>
                       <a:fillRect/>
                     </a:stretch>
@@ -2183,7 +2191,7 @@
                   <pic:spPr>
                     <a:xfrm>
                       <a:off x="0" y="0"/>
-                      <a:ext cx="5846442" cy="3288925"/>
+                      <a:ext cx="5387949" cy="2997075"/>
                     </a:xfrm>
                     <a:prstGeom prst="rect">
                       <a:avLst/>
@@ -2195,6 +2203,11 @@
           </wp:inline>
         </w:drawing>
       </w:r>
+    </w:p>
+    <w:p>
+      <w:pPr>
+        <w:ind w:firstLine="0"/>
+      </w:pPr>
     </w:p>
     <w:p>
       <w:pPr>
@@ -3623,7 +3636,7 @@
     <w:p>
       <w:pPr>
         <w:pStyle w:val="Prrafodelista"/>
-        <w:ind w:left="1429" w:firstLine="0"/>
+        <w:ind w:left="360" w:firstLine="0"/>
         <w:rPr>
           <w:b/>
           <w:bCs/>
@@ -3692,7 +3705,7 @@
     <w:p>
       <w:pPr>
         <w:pStyle w:val="Prrafodelista"/>
-        <w:ind w:left="1429" w:firstLine="0"/>
+        <w:ind w:left="360" w:firstLine="0"/>
         <w:rPr>
           <w:b/>
           <w:bCs/>
@@ -3755,44 +3768,35 @@
         <w:rPr>
           <w:lang w:val="es-419" w:eastAsia="es-CO"/>
         </w:rPr>
-        <w:t xml:space="preserve">l CES es una métrica que evalúa el nivel de esfuerzo que requiere un cliente para solucionar un problema o </w:t>
+        <w:t xml:space="preserve">l CES es una métrica que evalúa el nivel de esfuerzo que requiere un cliente para solucionar un problema o lograr un objetivo con una empresa. Se aplica normalmente después de una interacción de soporte, </w:t>
       </w:r>
       <w:r>
         <w:rPr>
           <w:lang w:val="es-419" w:eastAsia="es-CO"/>
         </w:rPr>
         <w:lastRenderedPageBreak/>
-        <w:t xml:space="preserve">lograr un objetivo con una empresa. Se aplica normalmente después de una interacción de soporte, mediante una pregunta sobre la facilidad del proceso. Una puntuación baja sugiere una experiencia sencilla y satisfactoria, mientras que una alta puede evidenciar obstáculos. </w:t>
+        <w:t xml:space="preserve">mediante una pregunta sobre la facilidad del proceso. Una puntuación baja sugiere una experiencia sencilla y satisfactoria, mientras que una alta puede evidenciar obstáculos. </w:t>
       </w:r>
     </w:p>
     <w:p>
       <w:pPr>
         <w:pStyle w:val="Prrafodelista"/>
-        <w:ind w:left="1429" w:firstLine="0"/>
-        <w:rPr>
-          <w:lang w:val="es-419" w:eastAsia="es-CO"/>
-        </w:rPr>
-      </w:pPr>
+        <w:ind w:left="360" w:firstLine="0"/>
+        <w:rPr>
+          <w:lang w:val="es-419" w:eastAsia="es-CO"/>
+        </w:rPr>
+      </w:pPr>
+      <w:r>
+        <w:rPr>
+          <w:lang w:val="es-419" w:eastAsia="es-CO"/>
+        </w:rPr>
+        <w:t>Por ejemplo, una plataforma digital puede solicitar a sus usuarios calificar qué tan fácil fue resolver un inconveniente técnico, lo cual ayuda a detectar oportunidades de mejora en la atención.</w:t>
+      </w:r>
     </w:p>
     <w:p>
       <w:pPr>
         <w:pStyle w:val="Prrafodelista"/>
-        <w:ind w:left="1429" w:firstLine="0"/>
-        <w:rPr>
-          <w:lang w:val="es-419" w:eastAsia="es-CO"/>
-        </w:rPr>
-      </w:pPr>
-      <w:r>
-        <w:rPr>
-          <w:lang w:val="es-419" w:eastAsia="es-CO"/>
-        </w:rPr>
-        <w:t>Por ejemplo, una plataforma digital puede solicitar a sus usuarios calificar qué tan fácil fue resolver un inconveniente técnico, lo cual ayuda a detectar oportunidades de mejora en la atención.</w:t>
-      </w:r>
-    </w:p>
-    <w:p>
-      <w:pPr>
-        <w:pStyle w:val="Prrafodelista"/>
-        <w:ind w:left="1429" w:firstLine="0"/>
+        <w:ind w:left="360" w:firstLine="0"/>
         <w:rPr>
           <w:b/>
           <w:bCs/>
@@ -3840,8 +3844,14 @@
         <w:rPr>
           <w:lang w:val="es-419" w:eastAsia="es-CO"/>
         </w:rPr>
+        <w:t xml:space="preserve">Actualmente, existe una amplia variedad de instrumentos para recoger esta información. Algunos se centran en métodos cuantitativos, como encuestas automatizadas, mientras que otros apelan a enfoques cualitativos, como entrevistas y grupos focales, que permiten una comprensión más profunda de la voz del cliente. </w:t>
+      </w:r>
+      <w:r>
+        <w:rPr>
+          <w:lang w:val="es-419" w:eastAsia="es-CO"/>
+        </w:rPr>
         <w:lastRenderedPageBreak/>
-        <w:t>Actualmente, existe una amplia variedad de instrumentos para recoger esta información. Algunos se centran en métodos cuantitativos, como encuestas automatizadas, mientras que otros apelan a enfoques cualitativos, como entrevistas y grupos focales, que permiten una comprensión más profunda de la voz del cliente. También hay tecnologías avanzadas como los sistemas CRM, que integran múltiples fuentes de datos y facilitan el análisis en tiempo real. Algunas herramientas son:</w:t>
+        <w:t>También hay tecnologías avanzadas como los sistemas CRM, que integran múltiples fuentes de datos y facilitan el análisis en tiempo real. Algunas herramientas son:</w:t>
       </w:r>
     </w:p>
     <w:p>
@@ -3980,14 +3990,7 @@
         <w:rPr>
           <w:lang w:val="es-419" w:eastAsia="es-CO"/>
         </w:rPr>
-        <w:t xml:space="preserve">on encuentros organizados con grupos reducidos de clientes, guiados por un moderador, en los que se discuten </w:t>
-      </w:r>
-      <w:r>
-        <w:rPr>
-          <w:lang w:val="es-419" w:eastAsia="es-CO"/>
-        </w:rPr>
-        <w:lastRenderedPageBreak/>
-        <w:t>experiencias, necesidades y propuestas de mejora. Este formato permite obtener una visión colectiva y diversa sobre un producto o servicio. Por ejemplo, una cadena de restaurantes puede reunir distintos perfiles de consumidores para evaluar un nuevo menú y ajustar detalles antes de su lanzamiento oficial.</w:t>
+        <w:t>on encuentros organizados con grupos reducidos de clientes, guiados por un moderador, en los que se discuten experiencias, necesidades y propuestas de mejora. Este formato permite obtener una visión colectiva y diversa sobre un producto o servicio. Por ejemplo, una cadena de restaurantes puede reunir distintos perfiles de consumidores para evaluar un nuevo menú y ajustar detalles antes de su lanzamiento oficial.</w:t>
       </w:r>
     </w:p>
     <w:p>
@@ -4035,7 +4038,14 @@
         <w:rPr>
           <w:lang w:val="es-419" w:eastAsia="es-CO"/>
         </w:rPr>
-        <w:t>onsiste en examinar de forma estructurada los reportes y reclamos de los clientes para identificar problemas recurrentes, causas de insatisfacción y áreas de mejora. Por ejemplo, una empresa de telecomunicaciones puede detectar, a través de sus registros, fallas frecuentes en ciertas zonas y tomar decisiones para optimizar el servicio en esos lugares.</w:t>
+        <w:t xml:space="preserve">onsiste en examinar de forma estructurada los reportes y reclamos de los clientes para identificar problemas recurrentes, causas </w:t>
+      </w:r>
+      <w:r>
+        <w:rPr>
+          <w:lang w:val="es-419" w:eastAsia="es-CO"/>
+        </w:rPr>
+        <w:lastRenderedPageBreak/>
+        <w:t>de insatisfacción y áreas de mejora. Por ejemplo, una empresa de telecomunicaciones puede detectar, a través de sus registros, fallas frecuentes en ciertas zonas y tomar decisiones para optimizar el servicio en esos lugares.</w:t>
       </w:r>
     </w:p>
     <w:p>
@@ -4116,7 +4126,6 @@
       </w:pPr>
       <w:bookmarkStart w:id="7" w:name="_Toc203128583"/>
       <w:r>
-        <w:lastRenderedPageBreak/>
         <w:t>Formatos, análisis y ejemplos de herramientas</w:t>
       </w:r>
       <w:bookmarkEnd w:id="7"/>
@@ -4166,6 +4175,7 @@
           <w:bCs/>
           <w:lang w:val="es-419" w:eastAsia="es-CO"/>
         </w:rPr>
+        <w:lastRenderedPageBreak/>
         <w:t xml:space="preserve">Encuesta de </w:t>
       </w:r>
       <w:r>
@@ -4209,7 +4219,7 @@
     <w:p>
       <w:pPr>
         <w:pStyle w:val="Prrafodelista"/>
-        <w:ind w:left="1429" w:firstLine="0"/>
+        <w:ind w:left="360" w:firstLine="0"/>
         <w:rPr>
           <w:lang w:val="es-419" w:eastAsia="es-CO"/>
         </w:rPr>
@@ -4224,7 +4234,7 @@
     <w:p>
       <w:pPr>
         <w:pStyle w:val="Prrafodelista"/>
-        <w:ind w:left="1429" w:firstLine="0"/>
+        <w:ind w:left="360" w:firstLine="0"/>
         <w:rPr>
           <w:lang w:val="es-419" w:eastAsia="es-CO"/>
         </w:rPr>
@@ -4286,20 +4296,13 @@
         <w:rPr>
           <w:lang w:val="es-419" w:eastAsia="es-CO"/>
         </w:rPr>
-        <w:t xml:space="preserve">sta encuesta tiene como finalidad recopilar información sobre la percepción de los usuarios en relación con la calidad del producto adquirido, el cumplimiento en los </w:t>
-      </w:r>
-      <w:r>
-        <w:rPr>
-          <w:lang w:val="es-419" w:eastAsia="es-CO"/>
-        </w:rPr>
-        <w:lastRenderedPageBreak/>
-        <w:t xml:space="preserve">tiempos de entrega, la protección durante el transporte y la intención de recompra. </w:t>
+        <w:t xml:space="preserve">sta encuesta tiene como finalidad recopilar información sobre la percepción de los usuarios en relación con la calidad del producto adquirido, el cumplimiento en los tiempos de entrega, la protección durante el transporte y la intención de recompra. </w:t>
       </w:r>
     </w:p>
     <w:p>
       <w:pPr>
         <w:pStyle w:val="Prrafodelista"/>
-        <w:ind w:left="1429" w:firstLine="0"/>
+        <w:ind w:left="360" w:firstLine="0"/>
         <w:rPr>
           <w:lang w:val="es-419" w:eastAsia="es-CO"/>
         </w:rPr>
@@ -4314,7 +4317,7 @@
     <w:p>
       <w:pPr>
         <w:pStyle w:val="Prrafodelista"/>
-        <w:ind w:left="1429" w:firstLine="0"/>
+        <w:ind w:left="360" w:firstLine="0"/>
         <w:rPr>
           <w:lang w:val="es-419" w:eastAsia="es-CO"/>
         </w:rPr>
@@ -4329,7 +4332,7 @@
     <w:p>
       <w:pPr>
         <w:pStyle w:val="Prrafodelista"/>
-        <w:ind w:left="1429" w:firstLine="0"/>
+        <w:ind w:left="360" w:firstLine="0"/>
         <w:rPr>
           <w:lang w:val="es-419" w:eastAsia="es-CO"/>
         </w:rPr>
@@ -4391,13 +4394,20 @@
         <w:rPr>
           <w:lang w:val="es-419" w:eastAsia="es-CO"/>
         </w:rPr>
-        <w:t xml:space="preserve">ste instrumento tiene como propósito recopilar información sobre el nivel de satisfacción del usuario respecto al servicio recibido, la atención brindada por el personal y la percepción del equilibrio entre el costo y la calidad del servicio. </w:t>
+        <w:t xml:space="preserve">ste instrumento tiene como propósito recopilar información sobre el nivel de satisfacción del usuario respecto </w:t>
+      </w:r>
+      <w:r>
+        <w:rPr>
+          <w:lang w:val="es-419" w:eastAsia="es-CO"/>
+        </w:rPr>
+        <w:lastRenderedPageBreak/>
+        <w:t xml:space="preserve">al servicio recibido, la atención brindada por el personal y la percepción del equilibrio entre el costo y la calidad del servicio. </w:t>
       </w:r>
     </w:p>
     <w:p>
       <w:pPr>
         <w:pStyle w:val="Prrafodelista"/>
-        <w:ind w:left="1429" w:firstLine="0"/>
+        <w:ind w:left="360" w:firstLine="0"/>
         <w:rPr>
           <w:b/>
           <w:bCs/>
@@ -4421,14 +4431,7 @@
         <w:rPr>
           <w:lang w:val="es-419" w:eastAsia="es-CO"/>
         </w:rPr>
-        <w:t xml:space="preserve">A continuación, se presentan los formatos estructurados de los instrumentos de recolección de información utilizados para evaluar la percepción y nivel de satisfacción de los usuarios frente a diversos aspectos del producto y/o servicio ofrecido. Cada plantilla ha sido diseñada bajo criterios técnicos de calidad, claridad y usabilidad, e incluye tanto preguntas cerradas con opciones de respuesta tipo escala, como espacios para observaciones cualitativas que permiten ampliar la comprensión de la experiencia del usuario. Estas herramientas facilitarán el análisis sistemático de </w:t>
-      </w:r>
-      <w:r>
-        <w:rPr>
-          <w:lang w:val="es-419" w:eastAsia="es-CO"/>
-        </w:rPr>
-        <w:lastRenderedPageBreak/>
-        <w:t>los datos recolectados y servirán como insumo para la toma de decisiones orientadas a la mejora continua.</w:t>
+        <w:t>A continuación, se presentan los formatos estructurados de los instrumentos de recolección de información utilizados para evaluar la percepción y nivel de satisfacción de los usuarios frente a diversos aspectos del producto y/o servicio ofrecido. Cada plantilla ha sido diseñada bajo criterios técnicos de calidad, claridad y usabilidad, e incluye tanto preguntas cerradas con opciones de respuesta tipo escala, como espacios para observaciones cualitativas que permiten ampliar la comprensión de la experiencia del usuario. Estas herramientas facilitarán el análisis sistemático de los datos recolectados y servirán como insumo para la toma de decisiones orientadas a la mejora continua.</w:t>
       </w:r>
     </w:p>
     <w:p>
@@ -4454,6 +4457,7 @@
       <w:tr>
         <w:trPr>
           <w:cnfStyle w:val="100000000000" w:firstRow="1" w:lastRow="0" w:firstColumn="0" w:lastColumn="0" w:oddVBand="0" w:evenVBand="0" w:oddHBand="0" w:evenHBand="0" w:firstRowFirstColumn="0" w:firstRowLastColumn="0" w:lastRowFirstColumn="0" w:lastRowLastColumn="0"/>
+          <w:tblHeader/>
         </w:trPr>
         <w:tc>
           <w:tcPr>
@@ -4620,6 +4624,7 @@
               </w:numPr>
             </w:pPr>
             <w:r>
+              <w:lastRenderedPageBreak/>
               <w:t>4. ¿Por qué razón calificaste tu respuesta de esta manera?</w:t>
             </w:r>
           </w:p>
@@ -4666,30 +4671,20 @@
         <w:rPr>
           <w:sz w:val="24"/>
         </w:rPr>
-        <w:t xml:space="preserve"> Kotler, P., &amp; Keller, K. L. (2016).</w:t>
+        <w:t xml:space="preserve"> Kotler, P., &amp; Keller, K. L. (2016)</w:t>
+      </w:r>
+      <w:r>
+        <w:rPr>
+          <w:sz w:val="24"/>
+        </w:rPr>
+        <w:t>.</w:t>
       </w:r>
     </w:p>
     <w:p>
       <w:pPr>
-        <w:spacing w:before="0" w:after="160" w:line="259" w:lineRule="auto"/>
-        <w:ind w:firstLine="0"/>
-        <w:rPr>
-          <w:lang w:val="es-419" w:eastAsia="es-CO"/>
-        </w:rPr>
-      </w:pPr>
-      <w:r>
-        <w:rPr>
-          <w:lang w:val="es-419" w:eastAsia="es-CO"/>
-        </w:rPr>
-        <w:br w:type="page"/>
-      </w:r>
-    </w:p>
-    <w:p>
-      <w:pPr>
         <w:pStyle w:val="Tabla"/>
       </w:pPr>
       <w:r>
-        <w:lastRenderedPageBreak/>
         <w:t>Encuesta de satisfacción del producto</w:t>
       </w:r>
     </w:p>
@@ -4699,7 +4694,7 @@
         <w:tblW w:w="0" w:type="auto"/>
         <w:tblLook w:val="04A0" w:firstRow="1" w:lastRow="0" w:firstColumn="1" w:lastColumn="0" w:noHBand="0" w:noVBand="1"/>
         <w:tblCaption w:val="Encuesta de satisfacción del producto."/>
-        <w:tblDescription w:val="En la tabla 3 se ilustra un modelo de encuesta de satisfacción del producto. Esta encuesta tiene como finalidad recopilar información sobre la percepción de los usuarios en relación con la calidad del producto adquirido, el cumplimiento en los tiempos de entrega, la protección durante el transporte y la intención de recompra. &#13;&#10;"/>
+        <w:tblDescription w:val="En la tabla 3 se ilustra un modelo de encuesta de satisfacción del producto. Esta encuesta tiene como finalidad recopilar información sobre la percepción de los usuarios en relación con la calidad del producto adquirido, el cumplimiento en los tiempos de "/>
       </w:tblPr>
       <w:tblGrid>
         <w:gridCol w:w="4839"/>
@@ -4984,6 +4979,7 @@
               </w:rPr>
             </w:pPr>
             <w:r>
+              <w:lastRenderedPageBreak/>
               <w:t>7. ¿Qué sugerencias tienes para mejorar el producto?</w:t>
             </w:r>
           </w:p>
@@ -5034,17 +5030,9 @@
     </w:p>
     <w:p>
       <w:pPr>
-        <w:rPr>
-          <w:lang w:val="es-419" w:eastAsia="es-CO"/>
-        </w:rPr>
-      </w:pPr>
-    </w:p>
-    <w:p>
-      <w:pPr>
         <w:pStyle w:val="Tabla"/>
       </w:pPr>
       <w:r>
-        <w:lastRenderedPageBreak/>
         <w:t>Encuesta de satisfacción del producto</w:t>
       </w:r>
     </w:p>
@@ -5054,7 +5042,7 @@
         <w:tblW w:w="0" w:type="auto"/>
         <w:tblLook w:val="04A0" w:firstRow="1" w:lastRow="0" w:firstColumn="1" w:lastColumn="0" w:noHBand="0" w:noVBand="1"/>
         <w:tblCaption w:val="Encuesta de satisfacción del producto."/>
-        <w:tblDescription w:val="En la tabla 4 se ilustra otro modelo de encuesta de satisfacción del producto. Esta encuesta tiene como finalidad recopilar información sobre la percepción de los usuarios en relación con la calidad del producto adquirido, el cumplimiento en los tiempos de entrega, la protección durante el transporte y la intención de recompra. &#13;&#10;"/>
+        <w:tblDescription w:val="En la tabla 4 se ilustra otro modelo de encuesta de satisfacción del producto. Esta encuesta tiene como finalidad recopilar información sobre la percepción de los usuarios en relación con la calidad del producto adquirido, el cumplimiento en los tiempos d"/>
       </w:tblPr>
       <w:tblGrid>
         <w:gridCol w:w="4839"/>
@@ -5329,6 +5317,7 @@
               </w:rPr>
             </w:pPr>
             <w:r>
+              <w:lastRenderedPageBreak/>
               <w:t>7. ¿Qué aspectos de nuestro servicio te gustaron más?</w:t>
             </w:r>
           </w:p>
@@ -5421,7 +5410,6 @@
         <w:rPr>
           <w:lang w:val="es-419" w:eastAsia="es-CO"/>
         </w:rPr>
-        <w:lastRenderedPageBreak/>
         <w:t xml:space="preserve">Además de los formatos estructurados aplicados mediante encuestas, es importante considerar otras fuentes de información relevantes para la medición de la percepción del cliente, como el análisis de redes sociales. Esta herramienta complementaria permite a las organizaciones monitorear en tiempo real las menciones y comentarios que los usuarios realizan sobre la marca, el producto o el servicio en plataformas digitales como X (anteriormente </w:t>
       </w:r>
       <w:r>
@@ -5462,7 +5450,14 @@
         <w:rPr>
           <w:lang w:val="es-419" w:eastAsia="es-CO"/>
         </w:rPr>
-        <w:t>El análisis de estas interacciones no solo facilita la detección oportuna de posibles inconformidades, sino que también permite identificar oportunidades de mejora, ajustar estrategias comunicacionales y responder de forma inmediata ante eventuales situaciones que puedan afectar la reputación. Por ejemplo, si un cliente publica una queja sobre un producto defectuoso, la empresa puede intervenir rápidamente con una respuesta pública adecuada y una solución efectiva, demostrando compromiso con la calidad y la satisfacción del cliente. Esta retroalimentación espontánea y directa se convierte así en un insumo valioso para fortalecer la relación con los usuarios y consolidar una imagen positiva de la organización.</w:t>
+        <w:t xml:space="preserve">El análisis de estas interacciones no solo facilita la detección oportuna de posibles inconformidades, sino que también permite identificar oportunidades de mejora, ajustar estrategias comunicacionales y responder de forma inmediata ante eventuales situaciones que puedan afectar la reputación. Por ejemplo, si un cliente publica una queja sobre un producto defectuoso, la empresa puede intervenir rápidamente con una respuesta pública adecuada y una solución efectiva, demostrando compromiso con la calidad y la satisfacción del cliente. Esta retroalimentación espontánea y directa se convierte así en un insumo valioso para </w:t>
+      </w:r>
+      <w:r>
+        <w:rPr>
+          <w:lang w:val="es-419" w:eastAsia="es-CO"/>
+        </w:rPr>
+        <w:lastRenderedPageBreak/>
+        <w:t>fortalecer la relación con los usuarios y consolidar una imagen positiva de la organización.</w:t>
       </w:r>
     </w:p>
     <w:p>
@@ -5475,14 +5470,7 @@
         <w:rPr>
           <w:lang w:val="es-419" w:eastAsia="es-CO"/>
         </w:rPr>
-        <w:t xml:space="preserve">Un ejemplo de esta estrategia puede observarse en el caso de una marca de ropa que monitorea activamente sus menciones en redes sociales. Al detectar una publicación de un cliente insatisfecho que recibió una prenda con defecto, el equipo de atención al cliente responde de manera inmediata, ofreciendo una disculpa pública y gestionando el reemplazo del producto. Esta acción no solo soluciona el inconveniente puntual, sino que también envía un mensaje claro al resto de la comunidad digital sobre el compromiso de la empresa con la calidad y la atención al </w:t>
-      </w:r>
-      <w:r>
-        <w:rPr>
-          <w:lang w:val="es-419" w:eastAsia="es-CO"/>
-        </w:rPr>
-        <w:lastRenderedPageBreak/>
-        <w:t>cliente. Este tipo de intervención refleja los principios del modelo SERVQUAL (Parasuraman, Zeithaml &amp; Berry, 1988), en tanto reconoce que la percepción del servicio puede gestionarse de forma efectiva mediante respuestas ágiles y empáticas en los canales donde los consumidores se expresan con mayor frecuencia.</w:t>
+        <w:t>Un ejemplo de esta estrategia puede observarse en el caso de una marca de ropa que monitorea activamente sus menciones en redes sociales. Al detectar una publicación de un cliente insatisfecho que recibió una prenda con defecto, el equipo de atención al cliente responde de manera inmediata, ofreciendo una disculpa pública y gestionando el reemplazo del producto. Esta acción no solo soluciona el inconveniente puntual, sino que también envía un mensaje claro al resto de la comunidad digital sobre el compromiso de la empresa con la calidad y la atención al cliente. Este tipo de intervención refleja los principios del modelo SERVQUAL (Parasuraman, Zeithaml &amp; Berry, 1988), en tanto reconoce que la percepción del servicio puede gestionarse de forma efectiva mediante respuestas ágiles y empáticas en los canales donde los consumidores se expresan con mayor frecuencia.</w:t>
       </w:r>
     </w:p>
     <w:p>
@@ -5562,6 +5550,7 @@
           <w:bCs/>
           <w:lang w:val="es-419" w:eastAsia="es-CO"/>
         </w:rPr>
+        <w:lastRenderedPageBreak/>
         <w:t xml:space="preserve">Situación: </w:t>
       </w:r>
       <w:r>
@@ -5606,14 +5595,7 @@
         <w:rPr>
           <w:lang w:val="es-419" w:eastAsia="es-CO"/>
         </w:rPr>
-        <w:t xml:space="preserve"> el equipo de atención al cliente de la marca, al detectar la mención de inmediato, responde públicamente en la misma plataforma con una disculpa por el inconveniente, ofreciendo un reemplazo gratuito de la prenda dañada. Además, el equipo proporciona un código de descuento para la próxima compra del cliente afectado. Esta respuesta </w:t>
-      </w:r>
-      <w:r>
-        <w:rPr>
-          <w:lang w:val="es-419" w:eastAsia="es-CO"/>
-        </w:rPr>
-        <w:lastRenderedPageBreak/>
-        <w:t>no solo resuelve el problema directamente, sino que también demuestra públicamente el compromiso de la marca con la satisfacción del cliente</w:t>
+        <w:t xml:space="preserve"> el equipo de atención al cliente de la marca, al detectar la mención de inmediato, responde públicamente en la misma plataforma con una disculpa por el inconveniente, ofreciendo un reemplazo gratuito de la prenda dañada. Además, el equipo proporciona un código de descuento para la próxima compra del cliente afectado. Esta respuesta no solo resuelve el problema directamente, sino que también demuestra públicamente el compromiso de la marca con la satisfacción del cliente</w:t>
       </w:r>
     </w:p>
     <w:p>
@@ -5652,7 +5634,14 @@
         <w:rPr>
           <w:lang w:val="es-419" w:eastAsia="es-CO"/>
         </w:rPr>
-        <w:t>A partir del ejemplo expuesto, es posible identificar diversas ventajas que ofrece el análisis de redes sociales como herramienta para la gestión de la percepción del cliente. Más allá de ser un canal reactivo ante quejas o comentarios negativos, esta estrategia permite a las organizaciones anticiparse a posibles crisis, fortalecer la comunicación con sus audiencias y construir relaciones más sólidas y transparentes. A continuación, se presentan algunos de los principales beneficios asociados al uso del análisis de redes sociales en la gestión de la experiencia del cliente.</w:t>
+        <w:t xml:space="preserve">A partir del ejemplo expuesto, es posible identificar diversas ventajas que ofrece el análisis de redes sociales como herramienta para la gestión de la percepción del cliente. Más allá de ser un canal reactivo ante quejas o comentarios negativos, esta estrategia permite a las organizaciones anticiparse a posibles crisis, fortalecer la comunicación con sus audiencias y construir relaciones más sólidas y transparentes. A continuación, se presentan algunos de los principales beneficios </w:t>
+      </w:r>
+      <w:r>
+        <w:rPr>
+          <w:lang w:val="es-419" w:eastAsia="es-CO"/>
+        </w:rPr>
+        <w:lastRenderedPageBreak/>
+        <w:t>asociados al uso del análisis de redes sociales en la gestión de la experiencia del cliente.</w:t>
       </w:r>
     </w:p>
     <w:p>
@@ -5730,7 +5719,6 @@
           <w:bCs/>
           <w:lang w:val="es-419" w:eastAsia="es-CO"/>
         </w:rPr>
-        <w:lastRenderedPageBreak/>
         <w:t>Monitoreo de sentimiento:</w:t>
       </w:r>
       <w:r>
@@ -6913,7 +6901,13 @@
     </w:p>
     <w:p>
       <w:r>
-        <w:t>El manejo adecuado de las quejas y reclamos es un componente esencial en la estrategia de servicio al cliente. Requiere habilidades interpersonales, como la escucha activa, la empatía, y la capacidad para analizar la situación de forma objetiva y ofrecer soluciones rápidas y eficaces. Empresas que gestionan correctamente estas situaciones no solo resuelven el problema, sino que también convierten la experiencia negativa en una oportunidad para fortalecer la relación con el cliente (González &amp; Martínez, 2019).</w:t>
+        <w:t>El manejo adecuado de las quejas y reclamos es un componente esencial en la estrategia de servicio al cliente. Requiere habilidades interpersonales, como la escucha activa, la empatía, y la capacidad para analizar la situación de forma objetiva y ofrecer soluciones rápidas y eficaces. Empresas que gestionan correctamente estas situaciones no solo resuelven el problema, sino que también convierten la experiencia negativa en una oportunidad para fortalecer la relación con el cliente</w:t>
+      </w:r>
+      <w:r>
+        <w:t xml:space="preserve"> </w:t>
+      </w:r>
+      <w:r>
+        <w:t>(González &amp; Martínez, 2019).</w:t>
       </w:r>
     </w:p>
     <w:p>
@@ -8389,15 +8383,6 @@
         </w:rPr>
         <w:t xml:space="preserve"> </w:t>
       </w:r>
-      <w:hyperlink r:id="rId22" w:history="1">
-        <w:r>
-          <w:rPr>
-            <w:rStyle w:val="Hipervnculo"/>
-            <w:lang w:val="en-US" w:eastAsia="es-CO"/>
-          </w:rPr>
-          <w:t>https://www.leo.edu.pe/wp-content/uploads/2019/12/direccion-de-marketing-philip-kotler-1.pdf</w:t>
-        </w:r>
-      </w:hyperlink>
     </w:p>
     <w:p>
       <w:pPr>
@@ -8413,6 +8398,9 @@
         <w:t xml:space="preserve">Parasuraman, A., Zeithaml, V. A., &amp; Berry, L. L. (1988). SERVQUAL: </w:t>
       </w:r>
       <w:r>
+        <w:rPr>
+          <w:lang w:val="en-US"/>
+        </w:rPr>
         <w:t xml:space="preserve">A multiple-item scale for measuring consumer perceptions of service quality. </w:t>
       </w:r>
       <w:r>
@@ -8427,7 +8415,7 @@
         </w:rPr>
         <w:t xml:space="preserve"> </w:t>
       </w:r>
-      <w:hyperlink r:id="rId23" w:history="1">
+      <w:hyperlink r:id="rId22" w:history="1">
         <w:r>
           <w:rPr>
             <w:rStyle w:val="Hipervnculo"/>
@@ -8462,7 +8450,7 @@
         </w:rPr>
         <w:t xml:space="preserve">Peticiones, quejas, reclamos, sugerencias y denuncias – PQRS. </w:t>
       </w:r>
-      <w:hyperlink r:id="rId24" w:history="1">
+      <w:hyperlink r:id="rId23" w:history="1">
         <w:r>
           <w:rPr>
             <w:rStyle w:val="Hipervnculo"/>
@@ -8518,7 +8506,7 @@
         </w:rPr>
         <w:t xml:space="preserve"> </w:t>
       </w:r>
-      <w:hyperlink r:id="rId25" w:history="1">
+      <w:hyperlink r:id="rId24" w:history="1">
         <w:r>
           <w:rPr>
             <w:rStyle w:val="Hipervnculo"/>
@@ -9560,7 +9548,7 @@
                 <w:sz w:val="28"/>
                 <w:szCs w:val="28"/>
               </w:rPr>
-              <w:t>Jonathan Adie Villafañe</w:t>
+              <w:t>Jairo Luis Valencia Ebratt</w:t>
             </w:r>
           </w:p>
         </w:tc>
@@ -9632,7 +9620,7 @@
                 <w:szCs w:val="28"/>
               </w:rPr>
               <w:lastRenderedPageBreak/>
-              <w:t>Jairo Luis Valencia Ebratt</w:t>
+              <w:t>Jonathan Adie Villafañe</w:t>
             </w:r>
           </w:p>
         </w:tc>
@@ -9696,8 +9684,8 @@
       </w:pPr>
     </w:p>
     <w:sectPr>
-      <w:headerReference w:type="default" r:id="rId26"/>
-      <w:footerReference w:type="default" r:id="rId27"/>
+      <w:headerReference w:type="default" r:id="rId25"/>
+      <w:footerReference w:type="default" r:id="rId26"/>
       <w:pgSz w:w="12240" w:h="15840"/>
       <w:pgMar w:top="1701" w:right="1134" w:bottom="1134" w:left="1418" w:header="709" w:footer="737" w:gutter="0"/>
       <w:pgNumType w:start="1"/>
@@ -11161,7 +11149,7 @@
       <w:lvlText w:val=""/>
       <w:lvlJc w:val="left"/>
       <w:pPr>
-        <w:ind w:left="1429" w:hanging="360"/>
+        <w:ind w:left="1068" w:hanging="360"/>
       </w:pPr>
       <w:rPr>
         <w:rFonts w:ascii="Wingdings" w:hAnsi="Wingdings" w:hint="default"/>
@@ -11173,7 +11161,7 @@
       <w:lvlText w:val="o"/>
       <w:lvlJc w:val="left"/>
       <w:pPr>
-        <w:ind w:left="2149" w:hanging="360"/>
+        <w:ind w:left="1788" w:hanging="360"/>
       </w:pPr>
       <w:rPr>
         <w:rFonts w:ascii="Courier New" w:hAnsi="Courier New" w:cs="Courier New" w:hint="default"/>
@@ -11185,7 +11173,7 @@
       <w:lvlText w:val=""/>
       <w:lvlJc w:val="left"/>
       <w:pPr>
-        <w:ind w:left="2869" w:hanging="360"/>
+        <w:ind w:left="2508" w:hanging="360"/>
       </w:pPr>
       <w:rPr>
         <w:rFonts w:ascii="Wingdings" w:hAnsi="Wingdings" w:hint="default"/>
@@ -11197,7 +11185,7 @@
       <w:lvlText w:val=""/>
       <w:lvlJc w:val="left"/>
       <w:pPr>
-        <w:ind w:left="3589" w:hanging="360"/>
+        <w:ind w:left="3228" w:hanging="360"/>
       </w:pPr>
       <w:rPr>
         <w:rFonts w:ascii="Symbol" w:hAnsi="Symbol" w:hint="default"/>
@@ -11209,7 +11197,7 @@
       <w:lvlText w:val="o"/>
       <w:lvlJc w:val="left"/>
       <w:pPr>
-        <w:ind w:left="4309" w:hanging="360"/>
+        <w:ind w:left="3948" w:hanging="360"/>
       </w:pPr>
       <w:rPr>
         <w:rFonts w:ascii="Courier New" w:hAnsi="Courier New" w:cs="Courier New" w:hint="default"/>
@@ -11221,7 +11209,7 @@
       <w:lvlText w:val=""/>
       <w:lvlJc w:val="left"/>
       <w:pPr>
-        <w:ind w:left="5029" w:hanging="360"/>
+        <w:ind w:left="4668" w:hanging="360"/>
       </w:pPr>
       <w:rPr>
         <w:rFonts w:ascii="Wingdings" w:hAnsi="Wingdings" w:hint="default"/>
@@ -11233,7 +11221,7 @@
       <w:lvlText w:val=""/>
       <w:lvlJc w:val="left"/>
       <w:pPr>
-        <w:ind w:left="5749" w:hanging="360"/>
+        <w:ind w:left="5388" w:hanging="360"/>
       </w:pPr>
       <w:rPr>
         <w:rFonts w:ascii="Symbol" w:hAnsi="Symbol" w:hint="default"/>
@@ -11245,7 +11233,7 @@
       <w:lvlText w:val="o"/>
       <w:lvlJc w:val="left"/>
       <w:pPr>
-        <w:ind w:left="6469" w:hanging="360"/>
+        <w:ind w:left="6108" w:hanging="360"/>
       </w:pPr>
       <w:rPr>
         <w:rFonts w:ascii="Courier New" w:hAnsi="Courier New" w:cs="Courier New" w:hint="default"/>
@@ -11257,7 +11245,7 @@
       <w:lvlText w:val=""/>
       <w:lvlJc w:val="left"/>
       <w:pPr>
-        <w:ind w:left="7189" w:hanging="360"/>
+        <w:ind w:left="6828" w:hanging="360"/>
       </w:pPr>
       <w:rPr>
         <w:rFonts w:ascii="Wingdings" w:hAnsi="Wingdings" w:hint="default"/>
@@ -11929,7 +11917,7 @@
       <w:lvlText w:val=""/>
       <w:lvlJc w:val="left"/>
       <w:pPr>
-        <w:ind w:left="1789" w:hanging="360"/>
+        <w:ind w:left="1429" w:hanging="360"/>
       </w:pPr>
       <w:rPr>
         <w:rFonts w:ascii="Symbol" w:eastAsiaTheme="minorHAnsi" w:hAnsi="Symbol" w:cstheme="minorBidi" w:hint="default"/>
@@ -11941,7 +11929,7 @@
       <w:lvlText w:val="o"/>
       <w:lvlJc w:val="left"/>
       <w:pPr>
-        <w:ind w:left="2509" w:hanging="360"/>
+        <w:ind w:left="2149" w:hanging="360"/>
       </w:pPr>
       <w:rPr>
         <w:rFonts w:ascii="Courier New" w:hAnsi="Courier New" w:cs="Courier New" w:hint="default"/>
@@ -11953,7 +11941,7 @@
       <w:lvlText w:val=""/>
       <w:lvlJc w:val="left"/>
       <w:pPr>
-        <w:ind w:left="3229" w:hanging="360"/>
+        <w:ind w:left="2869" w:hanging="360"/>
       </w:pPr>
       <w:rPr>
         <w:rFonts w:ascii="Wingdings" w:hAnsi="Wingdings" w:hint="default"/>
@@ -11965,7 +11953,7 @@
       <w:lvlText w:val=""/>
       <w:lvlJc w:val="left"/>
       <w:pPr>
-        <w:ind w:left="3949" w:hanging="360"/>
+        <w:ind w:left="3589" w:hanging="360"/>
       </w:pPr>
       <w:rPr>
         <w:rFonts w:ascii="Symbol" w:hAnsi="Symbol" w:hint="default"/>
@@ -11977,7 +11965,7 @@
       <w:lvlText w:val="o"/>
       <w:lvlJc w:val="left"/>
       <w:pPr>
-        <w:ind w:left="4669" w:hanging="360"/>
+        <w:ind w:left="4309" w:hanging="360"/>
       </w:pPr>
       <w:rPr>
         <w:rFonts w:ascii="Courier New" w:hAnsi="Courier New" w:cs="Courier New" w:hint="default"/>
@@ -11989,7 +11977,7 @@
       <w:lvlText w:val=""/>
       <w:lvlJc w:val="left"/>
       <w:pPr>
-        <w:ind w:left="5389" w:hanging="360"/>
+        <w:ind w:left="5029" w:hanging="360"/>
       </w:pPr>
       <w:rPr>
         <w:rFonts w:ascii="Wingdings" w:hAnsi="Wingdings" w:hint="default"/>
@@ -12001,7 +11989,7 @@
       <w:lvlText w:val=""/>
       <w:lvlJc w:val="left"/>
       <w:pPr>
-        <w:ind w:left="6109" w:hanging="360"/>
+        <w:ind w:left="5749" w:hanging="360"/>
       </w:pPr>
       <w:rPr>
         <w:rFonts w:ascii="Symbol" w:hAnsi="Symbol" w:hint="default"/>
@@ -12013,7 +12001,7 @@
       <w:lvlText w:val="o"/>
       <w:lvlJc w:val="left"/>
       <w:pPr>
-        <w:ind w:left="6829" w:hanging="360"/>
+        <w:ind w:left="6469" w:hanging="360"/>
       </w:pPr>
       <w:rPr>
         <w:rFonts w:ascii="Courier New" w:hAnsi="Courier New" w:cs="Courier New" w:hint="default"/>
@@ -12025,7 +12013,7 @@
       <w:lvlText w:val=""/>
       <w:lvlJc w:val="left"/>
       <w:pPr>
-        <w:ind w:left="7549" w:hanging="360"/>
+        <w:ind w:left="7189" w:hanging="360"/>
       </w:pPr>
       <w:rPr>
         <w:rFonts w:ascii="Wingdings" w:hAnsi="Wingdings" w:hint="default"/>
@@ -14236,7 +14224,7 @@
       <w:lvlText w:val=""/>
       <w:lvlJc w:val="left"/>
       <w:pPr>
-        <w:ind w:left="1429" w:hanging="360"/>
+        <w:ind w:left="720" w:hanging="360"/>
       </w:pPr>
       <w:rPr>
         <w:rFonts w:ascii="Wingdings" w:hAnsi="Wingdings" w:hint="default"/>
@@ -14248,7 +14236,7 @@
       <w:lvlText w:val="o"/>
       <w:lvlJc w:val="left"/>
       <w:pPr>
-        <w:ind w:left="2149" w:hanging="360"/>
+        <w:ind w:left="1440" w:hanging="360"/>
       </w:pPr>
       <w:rPr>
         <w:rFonts w:ascii="Courier New" w:hAnsi="Courier New" w:cs="Courier New" w:hint="default"/>
@@ -14260,7 +14248,7 @@
       <w:lvlText w:val=""/>
       <w:lvlJc w:val="left"/>
       <w:pPr>
-        <w:ind w:left="2869" w:hanging="360"/>
+        <w:ind w:left="2160" w:hanging="360"/>
       </w:pPr>
       <w:rPr>
         <w:rFonts w:ascii="Wingdings" w:hAnsi="Wingdings" w:hint="default"/>
@@ -14272,7 +14260,7 @@
       <w:lvlText w:val=""/>
       <w:lvlJc w:val="left"/>
       <w:pPr>
-        <w:ind w:left="3589" w:hanging="360"/>
+        <w:ind w:left="2880" w:hanging="360"/>
       </w:pPr>
       <w:rPr>
         <w:rFonts w:ascii="Symbol" w:hAnsi="Symbol" w:hint="default"/>
@@ -14284,7 +14272,7 @@
       <w:lvlText w:val="o"/>
       <w:lvlJc w:val="left"/>
       <w:pPr>
-        <w:ind w:left="4309" w:hanging="360"/>
+        <w:ind w:left="3600" w:hanging="360"/>
       </w:pPr>
       <w:rPr>
         <w:rFonts w:ascii="Courier New" w:hAnsi="Courier New" w:cs="Courier New" w:hint="default"/>
@@ -14296,7 +14284,7 @@
       <w:lvlText w:val=""/>
       <w:lvlJc w:val="left"/>
       <w:pPr>
-        <w:ind w:left="5029" w:hanging="360"/>
+        <w:ind w:left="4320" w:hanging="360"/>
       </w:pPr>
       <w:rPr>
         <w:rFonts w:ascii="Wingdings" w:hAnsi="Wingdings" w:hint="default"/>
@@ -14308,7 +14296,7 @@
       <w:lvlText w:val=""/>
       <w:lvlJc w:val="left"/>
       <w:pPr>
-        <w:ind w:left="5749" w:hanging="360"/>
+        <w:ind w:left="5040" w:hanging="360"/>
       </w:pPr>
       <w:rPr>
         <w:rFonts w:ascii="Symbol" w:hAnsi="Symbol" w:hint="default"/>
@@ -14320,7 +14308,7 @@
       <w:lvlText w:val="o"/>
       <w:lvlJc w:val="left"/>
       <w:pPr>
-        <w:ind w:left="6469" w:hanging="360"/>
+        <w:ind w:left="5760" w:hanging="360"/>
       </w:pPr>
       <w:rPr>
         <w:rFonts w:ascii="Courier New" w:hAnsi="Courier New" w:cs="Courier New" w:hint="default"/>
@@ -14332,7 +14320,7 @@
       <w:lvlText w:val=""/>
       <w:lvlJc w:val="left"/>
       <w:pPr>
-        <w:ind w:left="7189" w:hanging="360"/>
+        <w:ind w:left="6480" w:hanging="360"/>
       </w:pPr>
       <w:rPr>
         <w:rFonts w:ascii="Wingdings" w:hAnsi="Wingdings" w:hint="default"/>
@@ -14348,7 +14336,7 @@
       <w:lvlText w:val=""/>
       <w:lvlJc w:val="left"/>
       <w:pPr>
-        <w:ind w:left="1776" w:hanging="360"/>
+        <w:ind w:left="1429" w:hanging="360"/>
       </w:pPr>
       <w:rPr>
         <w:rFonts w:ascii="Symbol" w:eastAsiaTheme="minorHAnsi" w:hAnsi="Symbol" w:cstheme="minorBidi" w:hint="default"/>
@@ -14360,7 +14348,7 @@
       <w:lvlText w:val="o"/>
       <w:lvlJc w:val="left"/>
       <w:pPr>
-        <w:ind w:left="2496" w:hanging="360"/>
+        <w:ind w:left="2149" w:hanging="360"/>
       </w:pPr>
       <w:rPr>
         <w:rFonts w:ascii="Courier New" w:hAnsi="Courier New" w:cs="Courier New" w:hint="default"/>
@@ -14372,7 +14360,7 @@
       <w:lvlText w:val=""/>
       <w:lvlJc w:val="left"/>
       <w:pPr>
-        <w:ind w:left="3216" w:hanging="360"/>
+        <w:ind w:left="2869" w:hanging="360"/>
       </w:pPr>
       <w:rPr>
         <w:rFonts w:ascii="Wingdings" w:hAnsi="Wingdings" w:hint="default"/>
@@ -14384,7 +14372,7 @@
       <w:lvlText w:val=""/>
       <w:lvlJc w:val="left"/>
       <w:pPr>
-        <w:ind w:left="3936" w:hanging="360"/>
+        <w:ind w:left="3589" w:hanging="360"/>
       </w:pPr>
       <w:rPr>
         <w:rFonts w:ascii="Symbol" w:hAnsi="Symbol" w:hint="default"/>
@@ -14396,7 +14384,7 @@
       <w:lvlText w:val="o"/>
       <w:lvlJc w:val="left"/>
       <w:pPr>
-        <w:ind w:left="4656" w:hanging="360"/>
+        <w:ind w:left="4309" w:hanging="360"/>
       </w:pPr>
       <w:rPr>
         <w:rFonts w:ascii="Courier New" w:hAnsi="Courier New" w:cs="Courier New" w:hint="default"/>
@@ -14408,7 +14396,7 @@
       <w:lvlText w:val=""/>
       <w:lvlJc w:val="left"/>
       <w:pPr>
-        <w:ind w:left="5376" w:hanging="360"/>
+        <w:ind w:left="5029" w:hanging="360"/>
       </w:pPr>
       <w:rPr>
         <w:rFonts w:ascii="Wingdings" w:hAnsi="Wingdings" w:hint="default"/>
@@ -14420,7 +14408,7 @@
       <w:lvlText w:val=""/>
       <w:lvlJc w:val="left"/>
       <w:pPr>
-        <w:ind w:left="6096" w:hanging="360"/>
+        <w:ind w:left="5749" w:hanging="360"/>
       </w:pPr>
       <w:rPr>
         <w:rFonts w:ascii="Symbol" w:hAnsi="Symbol" w:hint="default"/>
@@ -14432,7 +14420,7 @@
       <w:lvlText w:val="o"/>
       <w:lvlJc w:val="left"/>
       <w:pPr>
-        <w:ind w:left="6816" w:hanging="360"/>
+        <w:ind w:left="6469" w:hanging="360"/>
       </w:pPr>
       <w:rPr>
         <w:rFonts w:ascii="Courier New" w:hAnsi="Courier New" w:cs="Courier New" w:hint="default"/>
@@ -14444,7 +14432,7 @@
       <w:lvlText w:val=""/>
       <w:lvlJc w:val="left"/>
       <w:pPr>
-        <w:ind w:left="7536" w:hanging="360"/>
+        <w:ind w:left="7189" w:hanging="360"/>
       </w:pPr>
       <w:rPr>
         <w:rFonts w:ascii="Wingdings" w:hAnsi="Wingdings" w:hint="default"/>
@@ -14772,7 +14760,7 @@
       <w:lvlText w:val=""/>
       <w:lvlJc w:val="left"/>
       <w:pPr>
-        <w:ind w:left="1776" w:hanging="360"/>
+        <w:ind w:left="1068" w:hanging="360"/>
       </w:pPr>
       <w:rPr>
         <w:rFonts w:ascii="Symbol" w:eastAsiaTheme="minorHAnsi" w:hAnsi="Symbol" w:cstheme="minorBidi" w:hint="default"/>
@@ -14784,7 +14772,7 @@
       <w:lvlText w:val="o"/>
       <w:lvlJc w:val="left"/>
       <w:pPr>
-        <w:ind w:left="2496" w:hanging="360"/>
+        <w:ind w:left="1788" w:hanging="360"/>
       </w:pPr>
       <w:rPr>
         <w:rFonts w:ascii="Courier New" w:hAnsi="Courier New" w:cs="Courier New" w:hint="default"/>
@@ -14796,7 +14784,7 @@
       <w:lvlText w:val=""/>
       <w:lvlJc w:val="left"/>
       <w:pPr>
-        <w:ind w:left="3216" w:hanging="360"/>
+        <w:ind w:left="2508" w:hanging="360"/>
       </w:pPr>
       <w:rPr>
         <w:rFonts w:ascii="Wingdings" w:hAnsi="Wingdings" w:hint="default"/>
@@ -14808,7 +14796,7 @@
       <w:lvlText w:val=""/>
       <w:lvlJc w:val="left"/>
       <w:pPr>
-        <w:ind w:left="3936" w:hanging="360"/>
+        <w:ind w:left="3228" w:hanging="360"/>
       </w:pPr>
       <w:rPr>
         <w:rFonts w:ascii="Symbol" w:hAnsi="Symbol" w:hint="default"/>
@@ -14820,7 +14808,7 @@
       <w:lvlText w:val="o"/>
       <w:lvlJc w:val="left"/>
       <w:pPr>
-        <w:ind w:left="4656" w:hanging="360"/>
+        <w:ind w:left="3948" w:hanging="360"/>
       </w:pPr>
       <w:rPr>
         <w:rFonts w:ascii="Courier New" w:hAnsi="Courier New" w:cs="Courier New" w:hint="default"/>
@@ -14832,7 +14820,7 @@
       <w:lvlText w:val=""/>
       <w:lvlJc w:val="left"/>
       <w:pPr>
-        <w:ind w:left="5376" w:hanging="360"/>
+        <w:ind w:left="4668" w:hanging="360"/>
       </w:pPr>
       <w:rPr>
         <w:rFonts w:ascii="Wingdings" w:hAnsi="Wingdings" w:hint="default"/>
@@ -14844,7 +14832,7 @@
       <w:lvlText w:val=""/>
       <w:lvlJc w:val="left"/>
       <w:pPr>
-        <w:ind w:left="6096" w:hanging="360"/>
+        <w:ind w:left="5388" w:hanging="360"/>
       </w:pPr>
       <w:rPr>
         <w:rFonts w:ascii="Symbol" w:hAnsi="Symbol" w:hint="default"/>
@@ -14856,7 +14844,7 @@
       <w:lvlText w:val="o"/>
       <w:lvlJc w:val="left"/>
       <w:pPr>
-        <w:ind w:left="6816" w:hanging="360"/>
+        <w:ind w:left="6108" w:hanging="360"/>
       </w:pPr>
       <w:rPr>
         <w:rFonts w:ascii="Courier New" w:hAnsi="Courier New" w:cs="Courier New" w:hint="default"/>
@@ -14868,7 +14856,7 @@
       <w:lvlText w:val=""/>
       <w:lvlJc w:val="left"/>
       <w:pPr>
-        <w:ind w:left="7536" w:hanging="360"/>
+        <w:ind w:left="6828" w:hanging="360"/>
       </w:pPr>
       <w:rPr>
         <w:rFonts w:ascii="Wingdings" w:hAnsi="Wingdings" w:hint="default"/>
@@ -14971,7 +14959,7 @@
       <w:lvlText w:val=""/>
       <w:lvlJc w:val="left"/>
       <w:pPr>
-        <w:ind w:left="1429" w:hanging="360"/>
+        <w:ind w:left="720" w:hanging="360"/>
       </w:pPr>
       <w:rPr>
         <w:rFonts w:ascii="Symbol" w:eastAsiaTheme="minorHAnsi" w:hAnsi="Symbol" w:cstheme="minorBidi" w:hint="default"/>
@@ -14983,7 +14971,7 @@
       <w:lvlText w:val="o"/>
       <w:lvlJc w:val="left"/>
       <w:pPr>
-        <w:ind w:left="2149" w:hanging="360"/>
+        <w:ind w:left="1440" w:hanging="360"/>
       </w:pPr>
       <w:rPr>
         <w:rFonts w:ascii="Courier New" w:hAnsi="Courier New" w:cs="Courier New" w:hint="default"/>
@@ -14995,7 +14983,7 @@
       <w:lvlText w:val=""/>
       <w:lvlJc w:val="left"/>
       <w:pPr>
-        <w:ind w:left="2869" w:hanging="360"/>
+        <w:ind w:left="2160" w:hanging="360"/>
       </w:pPr>
       <w:rPr>
         <w:rFonts w:ascii="Wingdings" w:hAnsi="Wingdings" w:hint="default"/>
@@ -15007,7 +14995,7 @@
       <w:lvlText w:val=""/>
       <w:lvlJc w:val="left"/>
       <w:pPr>
-        <w:ind w:left="3589" w:hanging="360"/>
+        <w:ind w:left="2880" w:hanging="360"/>
       </w:pPr>
       <w:rPr>
         <w:rFonts w:ascii="Symbol" w:hAnsi="Symbol" w:hint="default"/>
@@ -15019,7 +15007,7 @@
       <w:lvlText w:val="o"/>
       <w:lvlJc w:val="left"/>
       <w:pPr>
-        <w:ind w:left="4309" w:hanging="360"/>
+        <w:ind w:left="3600" w:hanging="360"/>
       </w:pPr>
       <w:rPr>
         <w:rFonts w:ascii="Courier New" w:hAnsi="Courier New" w:cs="Courier New" w:hint="default"/>
@@ -15031,7 +15019,7 @@
       <w:lvlText w:val=""/>
       <w:lvlJc w:val="left"/>
       <w:pPr>
-        <w:ind w:left="5029" w:hanging="360"/>
+        <w:ind w:left="4320" w:hanging="360"/>
       </w:pPr>
       <w:rPr>
         <w:rFonts w:ascii="Wingdings" w:hAnsi="Wingdings" w:hint="default"/>
@@ -15043,7 +15031,7 @@
       <w:lvlText w:val=""/>
       <w:lvlJc w:val="left"/>
       <w:pPr>
-        <w:ind w:left="5749" w:hanging="360"/>
+        <w:ind w:left="5040" w:hanging="360"/>
       </w:pPr>
       <w:rPr>
         <w:rFonts w:ascii="Symbol" w:hAnsi="Symbol" w:hint="default"/>
@@ -15055,7 +15043,7 @@
       <w:lvlText w:val="o"/>
       <w:lvlJc w:val="left"/>
       <w:pPr>
-        <w:ind w:left="6469" w:hanging="360"/>
+        <w:ind w:left="5760" w:hanging="360"/>
       </w:pPr>
       <w:rPr>
         <w:rFonts w:ascii="Courier New" w:hAnsi="Courier New" w:cs="Courier New" w:hint="default"/>
@@ -15067,7 +15055,7 @@
       <w:lvlText w:val=""/>
       <w:lvlJc w:val="left"/>
       <w:pPr>
-        <w:ind w:left="7189" w:hanging="360"/>
+        <w:ind w:left="6480" w:hanging="360"/>
       </w:pPr>
       <w:rPr>
         <w:rFonts w:ascii="Wingdings" w:hAnsi="Wingdings" w:hint="default"/>
@@ -15987,7 +15975,7 @@
       <w:lvlText w:val=""/>
       <w:lvlJc w:val="left"/>
       <w:pPr>
-        <w:ind w:left="1429" w:hanging="360"/>
+        <w:ind w:left="360" w:hanging="360"/>
       </w:pPr>
       <w:rPr>
         <w:rFonts w:ascii="Wingdings" w:hAnsi="Wingdings" w:hint="default"/>
@@ -15999,7 +15987,7 @@
       <w:lvlText w:val="o"/>
       <w:lvlJc w:val="left"/>
       <w:pPr>
-        <w:ind w:left="2149" w:hanging="360"/>
+        <w:ind w:left="1080" w:hanging="360"/>
       </w:pPr>
       <w:rPr>
         <w:rFonts w:ascii="Courier New" w:hAnsi="Courier New" w:cs="Courier New" w:hint="default"/>
@@ -16011,7 +15999,7 @@
       <w:lvlText w:val=""/>
       <w:lvlJc w:val="left"/>
       <w:pPr>
-        <w:ind w:left="2869" w:hanging="360"/>
+        <w:ind w:left="1800" w:hanging="360"/>
       </w:pPr>
       <w:rPr>
         <w:rFonts w:ascii="Wingdings" w:hAnsi="Wingdings" w:hint="default"/>
@@ -16023,7 +16011,7 @@
       <w:lvlText w:val=""/>
       <w:lvlJc w:val="left"/>
       <w:pPr>
-        <w:ind w:left="3589" w:hanging="360"/>
+        <w:ind w:left="2520" w:hanging="360"/>
       </w:pPr>
       <w:rPr>
         <w:rFonts w:ascii="Symbol" w:hAnsi="Symbol" w:hint="default"/>
@@ -16035,7 +16023,7 @@
       <w:lvlText w:val="o"/>
       <w:lvlJc w:val="left"/>
       <w:pPr>
-        <w:ind w:left="4309" w:hanging="360"/>
+        <w:ind w:left="3240" w:hanging="360"/>
       </w:pPr>
       <w:rPr>
         <w:rFonts w:ascii="Courier New" w:hAnsi="Courier New" w:cs="Courier New" w:hint="default"/>
@@ -16047,7 +16035,7 @@
       <w:lvlText w:val=""/>
       <w:lvlJc w:val="left"/>
       <w:pPr>
-        <w:ind w:left="5029" w:hanging="360"/>
+        <w:ind w:left="3960" w:hanging="360"/>
       </w:pPr>
       <w:rPr>
         <w:rFonts w:ascii="Wingdings" w:hAnsi="Wingdings" w:hint="default"/>
@@ -16059,7 +16047,7 @@
       <w:lvlText w:val=""/>
       <w:lvlJc w:val="left"/>
       <w:pPr>
-        <w:ind w:left="5749" w:hanging="360"/>
+        <w:ind w:left="4680" w:hanging="360"/>
       </w:pPr>
       <w:rPr>
         <w:rFonts w:ascii="Symbol" w:hAnsi="Symbol" w:hint="default"/>
@@ -16071,7 +16059,7 @@
       <w:lvlText w:val="o"/>
       <w:lvlJc w:val="left"/>
       <w:pPr>
-        <w:ind w:left="6469" w:hanging="360"/>
+        <w:ind w:left="5400" w:hanging="360"/>
       </w:pPr>
       <w:rPr>
         <w:rFonts w:ascii="Courier New" w:hAnsi="Courier New" w:cs="Courier New" w:hint="default"/>
@@ -16083,7 +16071,7 @@
       <w:lvlText w:val=""/>
       <w:lvlJc w:val="left"/>
       <w:pPr>
-        <w:ind w:left="7189" w:hanging="360"/>
+        <w:ind w:left="6120" w:hanging="360"/>
       </w:pPr>
       <w:rPr>
         <w:rFonts w:ascii="Wingdings" w:hAnsi="Wingdings" w:hint="default"/>
@@ -18068,21 +18056,15 @@
 </file>
 
 <file path=customXml/item1.xml><?xml version="1.0" encoding="utf-8"?>
-<b:Sources xmlns:b="http://schemas.openxmlformats.org/officeDocument/2006/bibliography" xmlns="http://schemas.openxmlformats.org/officeDocument/2006/bibliography" SelectedStyle="\APASixthEditionOfficeOnline.xsl" StyleName="APA" Version="6"/>
+<?mso-contentType ?>
+<FormTemplates xmlns="http://schemas.microsoft.com/sharepoint/v3/contenttype/forms">
+  <Display>DocumentLibraryForm</Display>
+  <Edit>DocumentLibraryForm</Edit>
+  <New>DocumentLibraryForm</New>
+</FormTemplates>
 </file>
 
 <file path=customXml/item2.xml><?xml version="1.0" encoding="utf-8"?>
-<p:properties xmlns:p="http://schemas.microsoft.com/office/2006/metadata/properties" xmlns:xsi="http://www.w3.org/2001/XMLSchema-instance" xmlns:pc="http://schemas.microsoft.com/office/infopath/2007/PartnerControls">
-  <documentManagement>
-    <TaxCatchAll xmlns="cb45339b-ced9-4d0d-8f64-77573914d53b" xsi:nil="true"/>
-    <lcf76f155ced4ddcb4097134ff3c332f xmlns="43a3ca16-9c26-4813-b83f-4aec9927b43f">
-      <Terms xmlns="http://schemas.microsoft.com/office/infopath/2007/PartnerControls"/>
-    </lcf76f155ced4ddcb4097134ff3c332f>
-  </documentManagement>
-</p:properties>
-</file>
-
-<file path=customXml/item3.xml><?xml version="1.0" encoding="utf-8"?>
 <ct:contentTypeSchema xmlns:ct="http://schemas.microsoft.com/office/2006/metadata/contentType" xmlns:ma="http://schemas.microsoft.com/office/2006/metadata/properties/metaAttributes" ct:_="" ma:_="" ma:contentTypeName="Documento" ma:contentTypeID="0x01010049282E1EDBE9234EA9E6D38F720E265F" ma:contentTypeVersion="15" ma:contentTypeDescription="Crear nuevo documento." ma:contentTypeScope="" ma:versionID="b31c7aa9eaf043a08b87120b3c4916e3">
   <xsd:schema xmlns:xsd="http://www.w3.org/2001/XMLSchema" xmlns:xs="http://www.w3.org/2001/XMLSchema" xmlns:p="http://schemas.microsoft.com/office/2006/metadata/properties" xmlns:ns2="cb45339b-ced9-4d0d-8f64-77573914d53b" xmlns:ns3="43a3ca16-9c26-4813-b83f-4aec9927b43f" targetNamespace="http://schemas.microsoft.com/office/2006/metadata/properties" ma:root="true" ma:fieldsID="3533d065b04d75c457075bc55f1f5315" ns2:_="" ns3:_="">
     <xsd:import namespace="cb45339b-ced9-4d0d-8f64-77573914d53b"/>
@@ -18317,35 +18299,30 @@
 </ct:contentTypeSchema>
 </file>
 
+<file path=customXml/item3.xml><?xml version="1.0" encoding="utf-8"?>
+<p:properties xmlns:p="http://schemas.microsoft.com/office/2006/metadata/properties" xmlns:xsi="http://www.w3.org/2001/XMLSchema-instance" xmlns:pc="http://schemas.microsoft.com/office/infopath/2007/PartnerControls">
+  <documentManagement>
+    <TaxCatchAll xmlns="cb45339b-ced9-4d0d-8f64-77573914d53b" xsi:nil="true"/>
+    <lcf76f155ced4ddcb4097134ff3c332f xmlns="43a3ca16-9c26-4813-b83f-4aec9927b43f">
+      <Terms xmlns="http://schemas.microsoft.com/office/infopath/2007/PartnerControls"/>
+    </lcf76f155ced4ddcb4097134ff3c332f>
+  </documentManagement>
+</p:properties>
+</file>
+
 <file path=customXml/item4.xml><?xml version="1.0" encoding="utf-8"?>
-<?mso-contentType ?>
-<FormTemplates xmlns="http://schemas.microsoft.com/sharepoint/v3/contenttype/forms">
-  <Display>DocumentLibraryForm</Display>
-  <Edit>DocumentLibraryForm</Edit>
-  <New>DocumentLibraryForm</New>
-</FormTemplates>
+<b:Sources xmlns:b="http://schemas.openxmlformats.org/officeDocument/2006/bibliography" xmlns="http://schemas.openxmlformats.org/officeDocument/2006/bibliography" SelectedStyle="\APASixthEditionOfficeOnline.xsl" StyleName="APA" Version="6"/>
 </file>
 
 <file path=customXml/itemProps1.xml><?xml version="1.0" encoding="utf-8"?>
-<ds:datastoreItem xmlns:ds="http://schemas.openxmlformats.org/officeDocument/2006/customXml" ds:itemID="{E8AB44A3-7C62-4BD2-82ED-8ABC209970FA}">
+<ds:datastoreItem xmlns:ds="http://schemas.openxmlformats.org/officeDocument/2006/customXml" ds:itemID="{81CBDEC1-3B00-44ED-AD36-0268077980BA}">
   <ds:schemaRefs>
-    <ds:schemaRef ds:uri="http://schemas.openxmlformats.org/officeDocument/2006/bibliography"/>
+    <ds:schemaRef ds:uri="http://schemas.microsoft.com/sharepoint/v3/contenttype/forms"/>
   </ds:schemaRefs>
 </ds:datastoreItem>
 </file>
 
 <file path=customXml/itemProps2.xml><?xml version="1.0" encoding="utf-8"?>
-<ds:datastoreItem xmlns:ds="http://schemas.openxmlformats.org/officeDocument/2006/customXml" ds:itemID="{6929C9FE-9F22-4B98-96EF-1B541B3BD0B2}">
-  <ds:schemaRefs>
-    <ds:schemaRef ds:uri="http://schemas.microsoft.com/office/2006/metadata/properties"/>
-    <ds:schemaRef ds:uri="http://schemas.microsoft.com/office/infopath/2007/PartnerControls"/>
-    <ds:schemaRef ds:uri="cb45339b-ced9-4d0d-8f64-77573914d53b"/>
-    <ds:schemaRef ds:uri="43a3ca16-9c26-4813-b83f-4aec9927b43f"/>
-  </ds:schemaRefs>
-</ds:datastoreItem>
-</file>
-
-<file path=customXml/itemProps3.xml><?xml version="1.0" encoding="utf-8"?>
 <ds:datastoreItem xmlns:ds="http://schemas.openxmlformats.org/officeDocument/2006/customXml" ds:itemID="{DF43E046-DB0C-42D1-8C73-AE38B52F1ED7}">
   <ds:schemaRefs>
     <ds:schemaRef ds:uri="http://schemas.microsoft.com/office/2006/metadata/contentType"/>
@@ -18364,10 +18341,21 @@
 </ds:datastoreItem>
 </file>
 
+<file path=customXml/itemProps3.xml><?xml version="1.0" encoding="utf-8"?>
+<ds:datastoreItem xmlns:ds="http://schemas.openxmlformats.org/officeDocument/2006/customXml" ds:itemID="{6929C9FE-9F22-4B98-96EF-1B541B3BD0B2}">
+  <ds:schemaRefs>
+    <ds:schemaRef ds:uri="http://schemas.microsoft.com/office/2006/metadata/properties"/>
+    <ds:schemaRef ds:uri="http://schemas.microsoft.com/office/infopath/2007/PartnerControls"/>
+    <ds:schemaRef ds:uri="cb45339b-ced9-4d0d-8f64-77573914d53b"/>
+    <ds:schemaRef ds:uri="43a3ca16-9c26-4813-b83f-4aec9927b43f"/>
+  </ds:schemaRefs>
+</ds:datastoreItem>
+</file>
+
 <file path=customXml/itemProps4.xml><?xml version="1.0" encoding="utf-8"?>
-<ds:datastoreItem xmlns:ds="http://schemas.openxmlformats.org/officeDocument/2006/customXml" ds:itemID="{81CBDEC1-3B00-44ED-AD36-0268077980BA}">
+<ds:datastoreItem xmlns:ds="http://schemas.openxmlformats.org/officeDocument/2006/customXml" ds:itemID="{E8AB44A3-7C62-4BD2-82ED-8ABC209970FA}">
   <ds:schemaRefs>
-    <ds:schemaRef ds:uri="http://schemas.microsoft.com/sharepoint/v3/contenttype/forms"/>
+    <ds:schemaRef ds:uri="http://schemas.openxmlformats.org/officeDocument/2006/bibliography"/>
   </ds:schemaRefs>
 </ds:datastoreItem>
 </file>
</xml_diff>